<commit_message>
Update Lab05 presentation and teaching guides; preserve student TODOs
</commit_message>
<xml_diff>
--- a/Huong_dan.docx
+++ b/Huong_dan.docx
@@ -279,6 +279,12 @@
           <w:sz w:val="26"/>
         </w:rPr>
         <w:t>; truy vấn SQL chỉ có một hàng. Đóng rồi mở máy chủ PHP không làm mất hàng đã lưu.</w:t>
+      </w:r>
+    </w:p>
+    <w:p>
+      <w:pPr/>
+      <w:r>
+        <w:t>Giao diện Material 3 giữ nguyên kết nối và thao tác PostgreSQL của lab. Metadata chỉ đọc và khu thử vé/ghế độc lập với CSDL. Chỉ kết quả backend hiện có mới xác nhận lưu; khu thử không phải giao dịch thật.</w:t>
       </w:r>
     </w:p>
     <w:p>
@@ -4161,8 +4167,8 @@
     </w:p>
     <w:p>
       <w:pPr>
-        <w:keepNext/>
-        <w:keepLines/>
+        <w:keepNext w:val="0"/>
+        <w:keepLines w:val="0"/>
         <w:widowControl/>
         <w:spacing w:after="0" w:before="0" w:line="240" w:lineRule="auto"/>
         <w:ind w:firstLine="0" w:left="142" w:right="85"/>
@@ -4170,17 +4176,16 @@
       </w:pPr>
       <w:r>
         <w:rPr>
-          <w:rFonts w:ascii="Times New Roman" w:hAnsi="Times New Roman"/>
-          <w:b w:val="0"/>
-          <w:sz w:val="26"/>
+          <w:rFonts w:ascii="Consolas" w:hAnsi="Consolas"/>
+          <w:sz w:val="17"/>
         </w:rPr>
         <w:t>&lt;?php</w:t>
       </w:r>
     </w:p>
     <w:p>
       <w:pPr>
-        <w:keepNext/>
-        <w:keepLines/>
+        <w:keepNext w:val="0"/>
+        <w:keepLines w:val="0"/>
         <w:widowControl/>
         <w:spacing w:after="0" w:before="0" w:line="240" w:lineRule="auto"/>
         <w:ind w:firstLine="0" w:left="142" w:right="85"/>
@@ -4188,17 +4193,16 @@
       </w:pPr>
       <w:r>
         <w:rPr>
-          <w:rFonts w:ascii="Times New Roman" w:hAnsi="Times New Roman"/>
-          <w:b w:val="0"/>
-          <w:sz w:val="26"/>
+          <w:rFonts w:ascii="Consolas" w:hAnsi="Consolas"/>
+          <w:sz w:val="17"/>
         </w:rPr>
         <w:t>require __DIR__.'/../src/Session.php';</w:t>
       </w:r>
     </w:p>
     <w:p>
       <w:pPr>
-        <w:keepNext/>
-        <w:keepLines/>
+        <w:keepNext w:val="0"/>
+        <w:keepLines w:val="0"/>
         <w:widowControl/>
         <w:spacing w:after="0" w:before="0" w:line="240" w:lineRule="auto"/>
         <w:ind w:firstLine="0" w:left="142" w:right="85"/>
@@ -4206,17 +4210,16 @@
       </w:pPr>
       <w:r>
         <w:rPr>
-          <w:rFonts w:ascii="Times New Roman" w:hAnsi="Times New Roman"/>
-          <w:b w:val="0"/>
-          <w:sz w:val="26"/>
+          <w:rFonts w:ascii="Consolas" w:hAnsi="Consolas"/>
+          <w:sz w:val="17"/>
         </w:rPr>
         <w:t>require __DIR__.'/../src/Input.php';</w:t>
       </w:r>
     </w:p>
     <w:p>
       <w:pPr>
-        <w:keepNext/>
-        <w:keepLines/>
+        <w:keepNext w:val="0"/>
+        <w:keepLines w:val="0"/>
         <w:widowControl/>
         <w:spacing w:after="0" w:before="0" w:line="240" w:lineRule="auto"/>
         <w:ind w:firstLine="0" w:left="142" w:right="85"/>
@@ -4224,17 +4227,16 @@
       </w:pPr>
       <w:r>
         <w:rPr>
-          <w:rFonts w:ascii="Times New Roman" w:hAnsi="Times New Roman"/>
-          <w:b w:val="0"/>
-          <w:sz w:val="26"/>
+          <w:rFonts w:ascii="Consolas" w:hAnsi="Consolas"/>
+          <w:sz w:val="17"/>
         </w:rPr>
         <w:t>require __DIR__.'/../src/Draft.php';</w:t>
       </w:r>
     </w:p>
     <w:p>
       <w:pPr>
-        <w:keepNext/>
-        <w:keepLines/>
+        <w:keepNext w:val="0"/>
+        <w:keepLines w:val="0"/>
         <w:widowControl/>
         <w:spacing w:after="0" w:before="0" w:line="240" w:lineRule="auto"/>
         <w:ind w:firstLine="0" w:left="142" w:right="85"/>
@@ -4242,17 +4244,16 @@
       </w:pPr>
       <w:r>
         <w:rPr>
-          <w:rFonts w:ascii="Times New Roman" w:hAnsi="Times New Roman"/>
-          <w:b w:val="0"/>
-          <w:sz w:val="26"/>
+          <w:rFonts w:ascii="Consolas" w:hAnsi="Consolas"/>
+          <w:sz w:val="17"/>
         </w:rPr>
         <w:t>require __DIR__.'/../src/RegistrationRepository.php';</w:t>
       </w:r>
     </w:p>
     <w:p>
       <w:pPr>
-        <w:keepNext/>
-        <w:keepLines/>
+        <w:keepNext w:val="0"/>
+        <w:keepLines w:val="0"/>
         <w:widowControl/>
         <w:spacing w:after="0" w:before="0" w:line="240" w:lineRule="auto"/>
         <w:ind w:firstLine="0" w:left="142" w:right="85"/>
@@ -4260,17 +4261,16 @@
       </w:pPr>
       <w:r>
         <w:rPr>
-          <w:rFonts w:ascii="Times New Roman" w:hAnsi="Times New Roman"/>
-          <w:b w:val="0"/>
-          <w:sz w:val="26"/>
+          <w:rFonts w:ascii="Consolas" w:hAnsi="Consolas"/>
+          <w:sz w:val="17"/>
         </w:rPr>
         <w:t>$error = '';</w:t>
       </w:r>
     </w:p>
     <w:p>
       <w:pPr>
-        <w:keepNext/>
-        <w:keepLines/>
+        <w:keepNext w:val="0"/>
+        <w:keepLines w:val="0"/>
         <w:widowControl/>
         <w:spacing w:after="0" w:before="0" w:line="240" w:lineRule="auto"/>
         <w:ind w:firstLine="0" w:left="142" w:right="85"/>
@@ -4278,17 +4278,16 @@
       </w:pPr>
       <w:r>
         <w:rPr>
-          <w:rFonts w:ascii="Times New Roman" w:hAnsi="Times New Roman"/>
-          <w:b w:val="0"/>
-          <w:sz w:val="26"/>
+          <w:rFonts w:ascii="Consolas" w:hAnsi="Consolas"/>
+          <w:sz w:val="17"/>
         </w:rPr>
         <w:t>if ($_SERVER['REQUEST_METHOD'] === 'POST') {</w:t>
       </w:r>
     </w:p>
     <w:p>
       <w:pPr>
-        <w:keepNext/>
-        <w:keepLines/>
+        <w:keepNext w:val="0"/>
+        <w:keepLines w:val="0"/>
         <w:widowControl/>
         <w:spacing w:after="0" w:before="0" w:line="240" w:lineRule="auto"/>
         <w:ind w:firstLine="0" w:left="142" w:right="85"/>
@@ -4296,17 +4295,16 @@
       </w:pPr>
       <w:r>
         <w:rPr>
-          <w:rFonts w:ascii="Times New Roman" w:hAnsi="Times New Roman"/>
-          <w:b w:val="0"/>
-          <w:sz w:val="26"/>
+          <w:rFonts w:ascii="Consolas" w:hAnsi="Consolas"/>
+          <w:sz w:val="17"/>
         </w:rPr>
         <w:t xml:space="preserve">    checkCsrf($_POST);</w:t>
       </w:r>
     </w:p>
     <w:p>
       <w:pPr>
-        <w:keepNext/>
-        <w:keepLines/>
+        <w:keepNext w:val="0"/>
+        <w:keepLines w:val="0"/>
         <w:widowControl/>
         <w:spacing w:after="0" w:before="0" w:line="240" w:lineRule="auto"/>
         <w:ind w:firstLine="0" w:left="142" w:right="85"/>
@@ -4314,17 +4312,16 @@
       </w:pPr>
       <w:r>
         <w:rPr>
-          <w:rFonts w:ascii="Times New Roman" w:hAnsi="Times New Roman"/>
-          <w:b w:val="0"/>
-          <w:sz w:val="26"/>
+          <w:rFonts w:ascii="Consolas" w:hAnsi="Consolas"/>
+          <w:sz w:val="17"/>
         </w:rPr>
         <w:t xml:space="preserve">    if (draftExpired($_SESSION,time(),1800)) {</w:t>
       </w:r>
     </w:p>
     <w:p>
       <w:pPr>
-        <w:keepNext/>
-        <w:keepLines/>
+        <w:keepNext w:val="0"/>
+        <w:keepLines w:val="0"/>
         <w:widowControl/>
         <w:spacing w:after="0" w:before="0" w:line="240" w:lineRule="auto"/>
         <w:ind w:firstLine="0" w:left="142" w:right="85"/>
@@ -4332,17 +4329,16 @@
       </w:pPr>
       <w:r>
         <w:rPr>
-          <w:rFonts w:ascii="Times New Roman" w:hAnsi="Times New Roman"/>
-          <w:b w:val="0"/>
-          <w:sz w:val="26"/>
+          <w:rFonts w:ascii="Consolas" w:hAnsi="Consolas"/>
+          <w:sz w:val="17"/>
         </w:rPr>
         <w:t xml:space="preserve">        cancelDraft($_SESSION); header('Location: /register.php',true,303); exit;</w:t>
       </w:r>
     </w:p>
     <w:p>
       <w:pPr>
-        <w:keepNext/>
-        <w:keepLines/>
+        <w:keepNext w:val="0"/>
+        <w:keepLines w:val="0"/>
         <w:widowControl/>
         <w:spacing w:after="0" w:before="0" w:line="240" w:lineRule="auto"/>
         <w:ind w:firstLine="0" w:left="142" w:right="85"/>
@@ -4350,17 +4346,16 @@
       </w:pPr>
       <w:r>
         <w:rPr>
-          <w:rFonts w:ascii="Times New Roman" w:hAnsi="Times New Roman"/>
-          <w:b w:val="0"/>
-          <w:sz w:val="26"/>
+          <w:rFonts w:ascii="Consolas" w:hAnsi="Consolas"/>
+          <w:sz w:val="17"/>
         </w:rPr>
         <w:t xml:space="preserve">    }</w:t>
       </w:r>
     </w:p>
     <w:p>
       <w:pPr>
-        <w:keepNext/>
-        <w:keepLines/>
+        <w:keepNext w:val="0"/>
+        <w:keepLines w:val="0"/>
         <w:widowControl/>
         <w:spacing w:after="0" w:before="0" w:line="240" w:lineRule="auto"/>
         <w:ind w:firstLine="0" w:left="142" w:right="85"/>
@@ -4368,17 +4363,16 @@
       </w:pPr>
       <w:r>
         <w:rPr>
-          <w:rFonts w:ascii="Times New Roman" w:hAnsi="Times New Roman"/>
-          <w:b w:val="0"/>
-          <w:sz w:val="26"/>
+          <w:rFonts w:ascii="Consolas" w:hAnsi="Consolas"/>
+          <w:sz w:val="17"/>
         </w:rPr>
         <w:t xml:space="preserve">    try {</w:t>
       </w:r>
     </w:p>
     <w:p>
       <w:pPr>
-        <w:keepNext/>
-        <w:keepLines/>
+        <w:keepNext w:val="0"/>
+        <w:keepLines w:val="0"/>
         <w:widowControl/>
         <w:spacing w:after="0" w:before="0" w:line="240" w:lineRule="auto"/>
         <w:ind w:firstLine="0" w:left="142" w:right="85"/>
@@ -4386,17 +4380,16 @@
       </w:pPr>
       <w:r>
         <w:rPr>
-          <w:rFonts w:ascii="Times New Roman" w:hAnsi="Times New Roman"/>
-          <w:b w:val="0"/>
-          <w:sz w:val="26"/>
+          <w:rFonts w:ascii="Consolas" w:hAnsi="Consolas"/>
+          <w:sz w:val="17"/>
         </w:rPr>
         <w:t xml:space="preserve">        $data = $_SESSION['draft']['data'];</w:t>
       </w:r>
     </w:p>
     <w:p>
       <w:pPr>
-        <w:keepNext/>
-        <w:keepLines/>
+        <w:keepNext w:val="0"/>
+        <w:keepLines w:val="0"/>
         <w:widowControl/>
         <w:spacing w:after="0" w:before="0" w:line="240" w:lineRule="auto"/>
         <w:ind w:firstLine="0" w:left="142" w:right="85"/>
@@ -4404,17 +4397,16 @@
       </w:pPr>
       <w:r>
         <w:rPr>
-          <w:rFonts w:ascii="Times New Roman" w:hAnsi="Times New Roman"/>
-          <w:b w:val="0"/>
-          <w:sz w:val="26"/>
+          <w:rFonts w:ascii="Consolas" w:hAnsi="Consolas"/>
+          <w:sz w:val="17"/>
         </w:rPr>
         <w:t xml:space="preserve">        $repo = new RegistrationRepository(db());</w:t>
       </w:r>
     </w:p>
     <w:p>
       <w:pPr>
-        <w:keepNext/>
-        <w:keepLines/>
+        <w:keepNext w:val="0"/>
+        <w:keepLines w:val="0"/>
         <w:widowControl/>
         <w:spacing w:after="0" w:before="0" w:line="240" w:lineRule="auto"/>
         <w:ind w:firstLine="0" w:left="142" w:right="85"/>
@@ -4422,17 +4414,16 @@
       </w:pPr>
       <w:r>
         <w:rPr>
-          <w:rFonts w:ascii="Times New Roman" w:hAnsi="Times New Roman"/>
-          <w:b w:val="0"/>
-          <w:sz w:val="26"/>
+          <w:rFonts w:ascii="Consolas" w:hAnsi="Consolas"/>
+          <w:sz w:val="17"/>
         </w:rPr>
         <w:t xml:space="preserve">        $_SESSION['completed'] = $repo-&gt;save($data['event_id'],$data['name'],$data['email']);</w:t>
       </w:r>
     </w:p>
     <w:p>
       <w:pPr>
-        <w:keepNext/>
-        <w:keepLines/>
+        <w:keepNext w:val="0"/>
+        <w:keepLines w:val="0"/>
         <w:widowControl/>
         <w:spacing w:after="0" w:before="0" w:line="240" w:lineRule="auto"/>
         <w:ind w:firstLine="0" w:left="142" w:right="85"/>
@@ -4440,17 +4431,16 @@
       </w:pPr>
       <w:r>
         <w:rPr>
-          <w:rFonts w:ascii="Times New Roman" w:hAnsi="Times New Roman"/>
-          <w:b w:val="0"/>
-          <w:sz w:val="26"/>
+          <w:rFonts w:ascii="Consolas" w:hAnsi="Consolas"/>
+          <w:sz w:val="17"/>
         </w:rPr>
         <w:t xml:space="preserve">        cancelDraft($_SESSION);</w:t>
       </w:r>
     </w:p>
     <w:p>
       <w:pPr>
-        <w:keepNext/>
-        <w:keepLines/>
+        <w:keepNext w:val="0"/>
+        <w:keepLines w:val="0"/>
         <w:widowControl/>
         <w:spacing w:after="0" w:before="0" w:line="240" w:lineRule="auto"/>
         <w:ind w:firstLine="0" w:left="142" w:right="85"/>
@@ -4458,17 +4448,16 @@
       </w:pPr>
       <w:r>
         <w:rPr>
-          <w:rFonts w:ascii="Times New Roman" w:hAnsi="Times New Roman"/>
-          <w:b w:val="0"/>
-          <w:sz w:val="26"/>
+          <w:rFonts w:ascii="Consolas" w:hAnsi="Consolas"/>
+          <w:sz w:val="17"/>
         </w:rPr>
         <w:t xml:space="preserve">        header('Location: /complete.php',true,303); exit;</w:t>
       </w:r>
     </w:p>
     <w:p>
       <w:pPr>
-        <w:keepNext/>
-        <w:keepLines/>
+        <w:keepNext w:val="0"/>
+        <w:keepLines w:val="0"/>
         <w:widowControl/>
         <w:spacing w:after="0" w:before="0" w:line="240" w:lineRule="auto"/>
         <w:ind w:firstLine="0" w:left="142" w:right="85"/>
@@ -4476,17 +4465,16 @@
       </w:pPr>
       <w:r>
         <w:rPr>
-          <w:rFonts w:ascii="Times New Roman" w:hAnsi="Times New Roman"/>
-          <w:b w:val="0"/>
-          <w:sz w:val="26"/>
+          <w:rFonts w:ascii="Consolas" w:hAnsi="Consolas"/>
+          <w:sz w:val="17"/>
         </w:rPr>
         <w:t xml:space="preserve">    } catch (Throwable $ex) {</w:t>
       </w:r>
     </w:p>
     <w:p>
       <w:pPr>
-        <w:keepNext/>
-        <w:keepLines/>
+        <w:keepNext w:val="0"/>
+        <w:keepLines w:val="0"/>
         <w:widowControl/>
         <w:spacing w:after="0" w:before="0" w:line="240" w:lineRule="auto"/>
         <w:ind w:firstLine="0" w:left="142" w:right="85"/>
@@ -4494,17 +4482,16 @@
       </w:pPr>
       <w:r>
         <w:rPr>
-          <w:rFonts w:ascii="Times New Roman" w:hAnsi="Times New Roman"/>
-          <w:b w:val="0"/>
-          <w:sz w:val="26"/>
+          <w:rFonts w:ascii="Consolas" w:hAnsi="Consolas"/>
+          <w:sz w:val="17"/>
         </w:rPr>
         <w:t xml:space="preserve">        error_log('CommunityPass: registration_save_failed');</w:t>
       </w:r>
     </w:p>
     <w:p>
       <w:pPr>
-        <w:keepNext/>
-        <w:keepLines/>
+        <w:keepNext w:val="0"/>
+        <w:keepLines w:val="0"/>
         <w:widowControl/>
         <w:spacing w:after="0" w:before="0" w:line="240" w:lineRule="auto"/>
         <w:ind w:firstLine="0" w:left="142" w:right="85"/>
@@ -4512,17 +4499,16 @@
       </w:pPr>
       <w:r>
         <w:rPr>
-          <w:rFonts w:ascii="Times New Roman" w:hAnsi="Times New Roman"/>
-          <w:b w:val="0"/>
-          <w:sz w:val="26"/>
+          <w:rFonts w:ascii="Consolas" w:hAnsi="Consolas"/>
+          <w:sz w:val="17"/>
         </w:rPr>
         <w:t xml:space="preserve">        http_response_code(503); $error = 'Không lưu được. Bản nháp vẫn được giữ để thử lại.';</w:t>
       </w:r>
     </w:p>
     <w:p>
       <w:pPr>
-        <w:keepNext/>
-        <w:keepLines/>
+        <w:keepNext w:val="0"/>
+        <w:keepLines w:val="0"/>
         <w:widowControl/>
         <w:spacing w:after="0" w:before="0" w:line="240" w:lineRule="auto"/>
         <w:ind w:firstLine="0" w:left="142" w:right="85"/>
@@ -4530,17 +4516,16 @@
       </w:pPr>
       <w:r>
         <w:rPr>
-          <w:rFonts w:ascii="Times New Roman" w:hAnsi="Times New Roman"/>
-          <w:b w:val="0"/>
-          <w:sz w:val="26"/>
+          <w:rFonts w:ascii="Consolas" w:hAnsi="Consolas"/>
+          <w:sz w:val="17"/>
         </w:rPr>
         <w:t xml:space="preserve">    }</w:t>
       </w:r>
     </w:p>
     <w:p>
       <w:pPr>
-        <w:keepNext/>
-        <w:keepLines/>
+        <w:keepNext w:val="0"/>
+        <w:keepLines w:val="0"/>
         <w:widowControl/>
         <w:spacing w:after="0" w:before="0" w:line="240" w:lineRule="auto"/>
         <w:ind w:firstLine="0" w:left="142" w:right="85"/>
@@ -4548,17 +4533,16 @@
       </w:pPr>
       <w:r>
         <w:rPr>
-          <w:rFonts w:ascii="Times New Roman" w:hAnsi="Times New Roman"/>
-          <w:b w:val="0"/>
-          <w:sz w:val="26"/>
+          <w:rFonts w:ascii="Consolas" w:hAnsi="Consolas"/>
+          <w:sz w:val="17"/>
         </w:rPr>
         <w:t>}</w:t>
       </w:r>
     </w:p>
     <w:p>
       <w:pPr>
-        <w:keepNext/>
-        <w:keepLines/>
+        <w:keepNext w:val="0"/>
+        <w:keepLines w:val="0"/>
         <w:widowControl/>
         <w:spacing w:after="0" w:before="0" w:line="240" w:lineRule="auto"/>
         <w:ind w:firstLine="0" w:left="142" w:right="85"/>
@@ -4566,17 +4550,16 @@
       </w:pPr>
       <w:r>
         <w:rPr>
-          <w:rFonts w:ascii="Times New Roman" w:hAnsi="Times New Roman"/>
-          <w:b w:val="0"/>
-          <w:sz w:val="26"/>
+          <w:rFonts w:ascii="Consolas" w:hAnsi="Consolas"/>
+          <w:sz w:val="17"/>
         </w:rPr>
         <w:t>if ($error === '' &amp;&amp; !isset($_SESSION['completed'])) {</w:t>
       </w:r>
     </w:p>
     <w:p>
       <w:pPr>
-        <w:keepNext/>
-        <w:keepLines/>
+        <w:keepNext w:val="0"/>
+        <w:keepLines w:val="0"/>
         <w:widowControl/>
         <w:spacing w:after="0" w:before="0" w:line="240" w:lineRule="auto"/>
         <w:ind w:firstLine="0" w:left="142" w:right="85"/>
@@ -4584,17 +4567,16 @@
       </w:pPr>
       <w:r>
         <w:rPr>
-          <w:rFonts w:ascii="Times New Roman" w:hAnsi="Times New Roman"/>
-          <w:b w:val="0"/>
-          <w:sz w:val="26"/>
+          <w:rFonts w:ascii="Consolas" w:hAnsi="Consolas"/>
+          <w:sz w:val="17"/>
         </w:rPr>
         <w:t xml:space="preserve">    header('Location: /register.php',true,303); exit;</w:t>
       </w:r>
     </w:p>
     <w:p>
       <w:pPr>
-        <w:keepNext/>
-        <w:keepLines/>
+        <w:keepNext w:val="0"/>
+        <w:keepLines w:val="0"/>
         <w:widowControl/>
         <w:spacing w:after="0" w:before="0" w:line="240" w:lineRule="auto"/>
         <w:ind w:firstLine="0" w:left="142" w:right="85"/>
@@ -4602,17 +4584,16 @@
       </w:pPr>
       <w:r>
         <w:rPr>
-          <w:rFonts w:ascii="Times New Roman" w:hAnsi="Times New Roman"/>
-          <w:b w:val="0"/>
-          <w:sz w:val="26"/>
+          <w:rFonts w:ascii="Consolas" w:hAnsi="Consolas"/>
+          <w:sz w:val="17"/>
         </w:rPr>
         <w:t>}</w:t>
       </w:r>
     </w:p>
     <w:p>
       <w:pPr>
-        <w:keepNext/>
-        <w:keepLines/>
+        <w:keepNext w:val="0"/>
+        <w:keepLines w:val="0"/>
         <w:widowControl/>
         <w:spacing w:after="0" w:before="0" w:line="240" w:lineRule="auto"/>
         <w:ind w:firstLine="0" w:left="142" w:right="85"/>
@@ -4620,17 +4601,16 @@
       </w:pPr>
       <w:r>
         <w:rPr>
-          <w:rFonts w:ascii="Times New Roman" w:hAnsi="Times New Roman"/>
-          <w:b w:val="0"/>
-          <w:sz w:val="26"/>
+          <w:rFonts w:ascii="Consolas" w:hAnsi="Consolas"/>
+          <w:sz w:val="17"/>
         </w:rPr>
         <w:t>require __DIR__.'/../templates/header.php';</w:t>
       </w:r>
     </w:p>
     <w:p>
       <w:pPr>
-        <w:keepNext/>
-        <w:keepLines/>
+        <w:keepNext w:val="0"/>
+        <w:keepLines w:val="0"/>
         <w:widowControl/>
         <w:spacing w:after="0" w:before="0" w:line="240" w:lineRule="auto"/>
         <w:ind w:firstLine="0" w:left="142" w:right="85"/>
@@ -4638,17 +4618,16 @@
       </w:pPr>
       <w:r>
         <w:rPr>
-          <w:rFonts w:ascii="Times New Roman" w:hAnsi="Times New Roman"/>
-          <w:b w:val="0"/>
-          <w:sz w:val="26"/>
+          <w:rFonts w:ascii="Consolas" w:hAnsi="Consolas"/>
+          <w:sz w:val="17"/>
         </w:rPr>
         <w:t>?&gt;</w:t>
       </w:r>
     </w:p>
     <w:p>
       <w:pPr>
-        <w:keepNext/>
-        <w:keepLines/>
+        <w:keepNext w:val="0"/>
+        <w:keepLines w:val="0"/>
         <w:widowControl/>
         <w:spacing w:after="0" w:before="0" w:line="240" w:lineRule="auto"/>
         <w:ind w:firstLine="0" w:left="142" w:right="85"/>
@@ -4656,17 +4635,16 @@
       </w:pPr>
       <w:r>
         <w:rPr>
-          <w:rFonts w:ascii="Times New Roman" w:hAnsi="Times New Roman"/>
-          <w:b w:val="0"/>
-          <w:sz w:val="26"/>
-        </w:rPr>
-        <w:t>&lt;h2&gt;Kết quả lưu trữ&lt;/h2&gt;</w:t>
+          <w:rFonts w:ascii="Consolas" w:hAnsi="Consolas"/>
+          <w:sz w:val="17"/>
+        </w:rPr>
+        <w:t>&lt;div class="page-heading"&gt;</w:t>
       </w:r>
     </w:p>
     <w:p>
       <w:pPr>
-        <w:keepNext/>
-        <w:keepLines/>
+        <w:keepNext w:val="0"/>
+        <w:keepLines w:val="0"/>
         <w:widowControl/>
         <w:spacing w:after="0" w:before="0" w:line="240" w:lineRule="auto"/>
         <w:ind w:firstLine="0" w:left="142" w:right="85"/>
@@ -4674,17 +4652,16 @@
       </w:pPr>
       <w:r>
         <w:rPr>
-          <w:rFonts w:ascii="Times New Roman" w:hAnsi="Times New Roman"/>
-          <w:b w:val="0"/>
-          <w:sz w:val="26"/>
-        </w:rPr>
-        <w:t>&lt;p&gt;</w:t>
+          <w:rFonts w:ascii="Consolas" w:hAnsi="Consolas"/>
+          <w:sz w:val="17"/>
+        </w:rPr>
+        <w:t>&lt;h1&gt;Kết quả lưu trữ&lt;/h1&gt;</w:t>
       </w:r>
     </w:p>
     <w:p>
       <w:pPr>
-        <w:keepNext/>
-        <w:keepLines/>
+        <w:keepNext w:val="0"/>
+        <w:keepLines w:val="0"/>
         <w:widowControl/>
         <w:spacing w:after="0" w:before="0" w:line="240" w:lineRule="auto"/>
         <w:ind w:firstLine="0" w:left="142" w:right="85"/>
@@ -4692,17 +4669,16 @@
       </w:pPr>
       <w:r>
         <w:rPr>
-          <w:rFonts w:ascii="Times New Roman" w:hAnsi="Times New Roman"/>
-          <w:b w:val="0"/>
-          <w:sz w:val="26"/>
-        </w:rPr>
-        <w:t>&lt;?= e($error !== '' ? $error : $_SESSION['completed']) ?&gt;</w:t>
+          <w:rFonts w:ascii="Consolas" w:hAnsi="Consolas"/>
+          <w:sz w:val="17"/>
+        </w:rPr>
+        <w:t>&lt;/div&gt;</w:t>
       </w:r>
     </w:p>
     <w:p>
       <w:pPr>
-        <w:keepNext/>
-        <w:keepLines/>
+        <w:keepNext w:val="0"/>
+        <w:keepLines w:val="0"/>
         <w:widowControl/>
         <w:spacing w:after="0" w:before="0" w:line="240" w:lineRule="auto"/>
         <w:ind w:firstLine="0" w:left="142" w:right="85"/>
@@ -4710,17 +4686,16 @@
       </w:pPr>
       <w:r>
         <w:rPr>
-          <w:rFonts w:ascii="Times New Roman" w:hAnsi="Times New Roman"/>
-          <w:b w:val="0"/>
-          <w:sz w:val="26"/>
-        </w:rPr>
-        <w:t>&lt;/p&gt;</w:t>
+          <w:rFonts w:ascii="Consolas" w:hAnsi="Consolas"/>
+          <w:sz w:val="17"/>
+        </w:rPr>
+        <w:t>&lt;section class="completion" role="status"&gt;</w:t>
       </w:r>
     </w:p>
     <w:p>
       <w:pPr>
-        <w:keepNext/>
-        <w:keepLines/>
+        <w:keepNext w:val="0"/>
+        <w:keepLines w:val="0"/>
         <w:widowControl/>
         <w:spacing w:after="0" w:before="0" w:line="240" w:lineRule="auto"/>
         <w:ind w:firstLine="0" w:left="142" w:right="85"/>
@@ -4728,17 +4703,16 @@
       </w:pPr>
       <w:r>
         <w:rPr>
-          <w:rFonts w:ascii="Times New Roman" w:hAnsi="Times New Roman"/>
-          <w:b w:val="0"/>
-          <w:sz w:val="26"/>
-        </w:rPr>
-        <w:t>&lt;p&gt;Mẫu Lab 05 kiểm tra lưu bền vững và đăng ký trùng; chưa có giới hạn chỗ đồng thời.&lt;/p&gt;</w:t>
+          <w:rFonts w:ascii="Consolas" w:hAnsi="Consolas"/>
+          <w:sz w:val="17"/>
+        </w:rPr>
+        <w:t>&lt;p class="status-message"&gt;</w:t>
       </w:r>
     </w:p>
     <w:p>
       <w:pPr>
         <w:keepNext w:val="0"/>
-        <w:keepLines/>
+        <w:keepLines w:val="0"/>
         <w:widowControl/>
         <w:spacing w:after="0" w:before="0" w:line="240" w:lineRule="auto"/>
         <w:ind w:firstLine="0" w:left="142" w:right="85"/>
@@ -4746,27 +4720,95 @@
       </w:pPr>
       <w:r>
         <w:rPr>
-          <w:rFonts w:ascii="Times New Roman" w:hAnsi="Times New Roman"/>
-          <w:b w:val="0"/>
-          <w:sz w:val="26"/>
-        </w:rPr>
-        <w:t>&lt;a href="/confirm.php"&gt;Quay lại xác nhận&lt;/a&gt;</w:t>
+          <w:rFonts w:ascii="Consolas" w:hAnsi="Consolas"/>
+          <w:sz w:val="17"/>
+        </w:rPr>
+        <w:t xml:space="preserve">    &lt;?= e($error !== '' ? $error : $_SESSION['completed']) ?&gt;</w:t>
       </w:r>
     </w:p>
     <w:p>
       <w:pPr>
+        <w:keepNext w:val="0"/>
+        <w:keepLines w:val="0"/>
         <w:widowControl/>
-        <w:spacing w:after="120" w:before="0" w:line="240" w:lineRule="auto"/>
+        <w:spacing w:after="0" w:before="0" w:line="240" w:lineRule="auto"/>
         <w:ind w:firstLine="0" w:left="142" w:right="85"/>
         <w:jc w:val="left"/>
       </w:pPr>
       <w:r>
         <w:rPr>
-          <w:rFonts w:ascii="Times New Roman" w:hAnsi="Times New Roman"/>
-          <w:b w:val="0"/>
-          <w:sz w:val="26"/>
-        </w:rPr>
-        <w:t>&lt;?php require __DIR__.'/../templates/footer.php'; ?&gt;</w:t>
+          <w:rFonts w:ascii="Consolas" w:hAnsi="Consolas"/>
+          <w:sz w:val="17"/>
+        </w:rPr>
+        <w:t>&lt;/p&gt;</w:t>
+      </w:r>
+    </w:p>
+    <w:p>
+      <w:pPr>
+        <w:keepNext w:val="0"/>
+        <w:keepLines w:val="0"/>
+        <w:widowControl/>
+        <w:spacing w:after="0" w:before="0" w:line="240" w:lineRule="auto"/>
+        <w:ind w:firstLine="0" w:left="142" w:right="85"/>
+        <w:jc w:val="left"/>
+      </w:pPr>
+      <w:r>
+        <w:rPr>
+          <w:rFonts w:ascii="Consolas" w:hAnsi="Consolas"/>
+          <w:sz w:val="17"/>
+        </w:rPr>
+        <w:t>&lt;p&gt;Mẫu Lab 05 kiểm tra lưu bền vững và đăng ký trùng; chưa có giới hạn chỗ đồng thời.&lt;/p&gt;</w:t>
+      </w:r>
+    </w:p>
+    <w:p>
+      <w:pPr>
+        <w:keepNext w:val="0"/>
+        <w:keepLines w:val="0"/>
+        <w:widowControl/>
+        <w:spacing w:after="0" w:before="0" w:line="240" w:lineRule="auto"/>
+        <w:ind w:firstLine="0" w:left="142" w:right="85"/>
+        <w:jc w:val="left"/>
+      </w:pPr>
+      <w:r>
+        <w:rPr>
+          <w:rFonts w:ascii="Consolas" w:hAnsi="Consolas"/>
+          <w:sz w:val="17"/>
+        </w:rPr>
+        <w:t>&lt;a href="/confirm.php"&gt;Quay lại xác nhận&lt;/a&gt;</w:t>
+      </w:r>
+    </w:p>
+    <w:p>
+      <w:pPr>
+        <w:keepNext w:val="0"/>
+        <w:keepLines w:val="0"/>
+        <w:widowControl/>
+        <w:spacing w:after="0" w:before="0" w:line="240" w:lineRule="auto"/>
+        <w:ind w:firstLine="0" w:left="142" w:right="85"/>
+        <w:jc w:val="left"/>
+      </w:pPr>
+      <w:r>
+        <w:rPr>
+          <w:rFonts w:ascii="Consolas" w:hAnsi="Consolas"/>
+          <w:sz w:val="17"/>
+        </w:rPr>
+        <w:t>&lt;/section&gt;</w:t>
+      </w:r>
+    </w:p>
+    <w:p>
+      <w:pPr>
+        <w:keepNext w:val="0"/>
+        <w:keepLines w:val="0"/>
+        <w:widowControl/>
+        <w:spacing w:after="0" w:before="0" w:line="240" w:lineRule="auto"/>
+        <w:ind w:firstLine="0" w:left="142" w:right="85"/>
+        <w:jc w:val="left"/>
+      </w:pPr>
+      <w:r>
+        <w:rPr>
+          <w:rFonts w:ascii="Consolas" w:hAnsi="Consolas"/>
+          <w:sz w:val="17"/>
+        </w:rPr>
+        <w:t>&lt;?php require __DIR__ . '/../templates/footer.php'; ?&gt;</w:t>
       </w:r>
     </w:p>
     <w:p>

</xml_diff>